<commit_message>
Evaluacion: dejar el componente abierto como "Talleres o Quiz"
El 10% del corte se nombraba distinto segun el documento: "Talleres y Quiz" en
los Acuerdos y "Talleres / Quiz" en las diapositivas. La "y" obligaba a que
contaran ambos; ahora queda explicitamente abierto ("o"), que es como el docente
lo aplica: el 10% se puede componer de talleres, de quices, o de ambos.

Unificado en los 4 cursos: Presentaciones del Curso, Acuerdos Pedagogicos,
LEEME y los builders (incluido gen_builds.py, para que un curso nuevo nazca
con la misma redaccion).

Co-Authored-By: Claude Opus 5 <noreply@anthropic.com>
</commit_message>
<xml_diff>
--- a/Arquitectura de Sistemas Computacionales/Entregas docente/2026-2/ACUERDO PEDAGOGICO - Arquitectura de Sistemas Computacionales - 2026-2.docx
+++ b/Arquitectura de Sistemas Computacionales/Entregas docente/2026-2/ACUERDO PEDAGOGICO - Arquitectura de Sistemas Computacionales - 2026-2.docx
@@ -877,12 +877,12 @@
               <w:br/>
               <w:t>Primer corte (30%) — [10/08/2026 al 13/09/2026] — Clases 1–5:</w:t>
               <w:br/>
-              <w:t>* 10% Parcial 1 (Clase 5 · 07/09/2026, presencial) | 10% Talleres y Quiz | 10% Asistencia</w:t>
+              <w:t>* 10% Parcial 1 (Clase 5 · 07/09/2026, presencial) | 10% Talleres o Quiz | 10% Asistencia</w:t>
               <w:br/>
               <w:br/>
               <w:t>Segundo corte (30%) — [14/09/2026 al 18/10/2026] — Clases 6–10:</w:t>
               <w:br/>
-              <w:t>* 10% Parcial 2 (Clase 9 · 05/10/2026, presencial; Clase 10 festivo = refuerzo sin parcial) | 10% Talleres y Quiz | 10% Asistencia</w:t>
+              <w:t>* 10% Parcial 2 (Clase 9 · 05/10/2026, presencial; Clase 10 festivo = refuerzo sin parcial) | 10% Talleres o Quiz | 10% Asistencia</w:t>
               <w:br/>
               <w:br/>
               <w:t>Tercer corte (40%) — [19/10/2026 al 22/11/2026] — Clases 11–15:</w:t>

</xml_diff>